<commit_message>
Pathophysiology revised run: incident course, antibiotic-anchored and documented-stratum results
Aggregate outputs and figures of the revised notebook 13 run (same study
key, incident sequences rebuilt to discharge, cache written) and an
addendum to the reading: deteriorating course marked before onset by
renal and respiratory reserve and the coagulation axis, not the vital
signs; GCS joins the early course separators; antibiotic-anchored
signature shorter with a rising qSOFA slope shared in both databases;
documented versus undocumented operational sepsis are two populations.
No protocol or notebook change.

Co-Authored-By: Claude Fable 5.1 <noreply@anthropic.com>
Claude-Session: https://claude.ai/code/session_01LgDqxV9dzSvE8XpquGaBd5
</commit_message>
<xml_diff>
--- a/dev/pathophysiology/Reading_run_3101b901d915324b.docx
+++ b/dev/pathophysiology/Reading_run_3101b901d915324b.docx
@@ -7,10 +7,10 @@
         <w:pStyle w:val="Title"/>
       </w:pPr>
       <w:r>
-        <w:t xml:space="preserve">What the data say about the disease: reading of the pathophysiology run (30 Oct 2026)</w:t>
-      </w:r>
-    </w:p>
-    <w:bookmarkStart w:id="28" w:name="X460a4824f4470e962465eb9784f6ba0341ea5cc"/>
+        <w:t xml:space="preserve">What the data say about the disease: reading of the pathophysiology run (30-31 Oct 2026)</w:t>
+      </w:r>
+    </w:p>
+    <w:bookmarkStart w:id="34" w:name="X460a4824f4470e962465eb9784f6ba0341ea5cc"/>
     <w:p>
       <w:pPr>
         <w:pStyle w:val="Heading1"/>
@@ -1915,8 +1915,396 @@
         <w:t xml:space="preserve">Put two questions to the consultants: whether a warning after the first antibiotic has value, and which course definition they recognise.</w:t>
       </w:r>
     </w:p>
+    <w:p>
+      <w:r>
+        <w:pict>
+          <v:rect style="width:0;height:1.5pt" o:hralign="center" o:hrstd="t" o:hr="t"/>
+        </w:pict>
+      </w:r>
+    </w:p>
     <w:bookmarkEnd w:id="27"/>
+    <w:bookmarkStart w:id="33" w:name="X6f054d0071c971a98992188b79106ca8b0c62d4"/>
+    <w:p>
+      <w:pPr>
+        <w:pStyle w:val="Heading2"/>
+      </w:pPr>
+      <w:r>
+        <w:t xml:space="preserve">Addendum, 31 October 2026: the revised run (same key, incident course readable, antibiotic anchor, documented strata)</w:t>
+      </w:r>
+    </w:p>
+    <w:p>
+      <w:pPr>
+        <w:pStyle w:val="FirstParagraph"/>
+      </w:pPr>
+      <w:r>
+        <w:t xml:space="preserve">The revised notebook was rerun on the same development samples. Incident stays were rebuilt from the raw stage to the ICU discharge, so their course is now read like the other strata; comparisons anchored on the first antibiotic and split by sepsis documentation were added. Counts: incident course in MIMIC-IV deteriorating 76, improving 40, indeterminate 102; in eICU 31, 24, 55, with 34 leaving the ICU alive before 48 h. Agreement between the 48-hour and 72-hour readings 97.9 % of 700 stays. The stage-2 shared pre-onset channel list became [</w:t>
+      </w:r>
+      <w:r>
+        <w:t xml:space="preserve">‘</w:t>
+      </w:r>
+      <w:r>
+        <w:t xml:space="preserve">Albumin</w:t>
+      </w:r>
+      <w:r>
+        <w:t xml:space="preserve">’</w:t>
+      </w:r>
+      <w:r>
+        <w:t xml:space="preserve">,</w:t>
+      </w:r>
+      <w:r>
+        <w:t xml:space="preserve"> </w:t>
+      </w:r>
+      <w:r>
+        <w:t xml:space="preserve">‘</w:t>
+      </w:r>
+      <w:r>
+        <w:t xml:space="preserve">HR</w:t>
+      </w:r>
+      <w:r>
+        <w:t xml:space="preserve">’</w:t>
+      </w:r>
+      <w:r>
+        <w:t xml:space="preserve">,</w:t>
+      </w:r>
+      <w:r>
+        <w:t xml:space="preserve"> </w:t>
+      </w:r>
+      <w:r>
+        <w:t xml:space="preserve">‘</w:t>
+      </w:r>
+      <w:r>
+        <w:t xml:space="preserve">Lymphocytes</w:t>
+      </w:r>
+      <w:r>
+        <w:t xml:space="preserve">’</w:t>
+      </w:r>
+      <w:r>
+        <w:t xml:space="preserve">,</w:t>
+      </w:r>
+      <w:r>
+        <w:t xml:space="preserve"> </w:t>
+      </w:r>
+      <w:r>
+        <w:t xml:space="preserve">‘</w:t>
+      </w:r>
+      <w:r>
+        <w:t xml:space="preserve">NEWS2_MetAmongMeasured</w:t>
+      </w:r>
+      <w:r>
+        <w:t xml:space="preserve">’</w:t>
+      </w:r>
+      <w:r>
+        <w:t xml:space="preserve">,</w:t>
+      </w:r>
+      <w:r>
+        <w:t xml:space="preserve"> </w:t>
+      </w:r>
+      <w:r>
+        <w:t xml:space="preserve">‘</w:t>
+      </w:r>
+      <w:r>
+        <w:t xml:space="preserve">NLR</w:t>
+      </w:r>
+      <w:r>
+        <w:t xml:space="preserve">’</w:t>
+      </w:r>
+      <w:r>
+        <w:t xml:space="preserve">,</w:t>
+      </w:r>
+      <w:r>
+        <w:t xml:space="preserve"> </w:t>
+      </w:r>
+      <w:r>
+        <w:t xml:space="preserve">‘</w:t>
+      </w:r>
+      <w:r>
+        <w:t xml:space="preserve">Neutrophils</w:t>
+      </w:r>
+      <w:r>
+        <w:t xml:space="preserve">’</w:t>
+      </w:r>
+      <w:r>
+        <w:t xml:space="preserve">,</w:t>
+      </w:r>
+      <w:r>
+        <w:t xml:space="preserve"> </w:t>
+      </w:r>
+      <w:r>
+        <w:t xml:space="preserve">‘</w:t>
+      </w:r>
+      <w:r>
+        <w:t xml:space="preserve">PTT</w:t>
+      </w:r>
+      <w:r>
+        <w:t xml:space="preserve">’</w:t>
+      </w:r>
+      <w:r>
+        <w:t xml:space="preserve">,</w:t>
+      </w:r>
+      <w:r>
+        <w:t xml:space="preserve"> </w:t>
+      </w:r>
+      <w:r>
+        <w:t xml:space="preserve">‘</w:t>
+      </w:r>
+      <w:r>
+        <w:t xml:space="preserve">Resp</w:t>
+      </w:r>
+      <w:r>
+        <w:t xml:space="preserve">’</w:t>
+      </w:r>
+      <w:r>
+        <w:t xml:space="preserve">,</w:t>
+      </w:r>
+      <w:r>
+        <w:t xml:space="preserve"> </w:t>
+      </w:r>
+      <w:r>
+        <w:t xml:space="preserve">‘</w:t>
+      </w:r>
+      <w:r>
+        <w:t xml:space="preserve">SF_Ratio</w:t>
+      </w:r>
+      <w:r>
+        <w:t xml:space="preserve">’</w:t>
+      </w:r>
+      <w:r>
+        <w:t xml:space="preserve">,</w:t>
+      </w:r>
+      <w:r>
+        <w:t xml:space="preserve"> </w:t>
+      </w:r>
+      <w:r>
+        <w:t xml:space="preserve">‘</w:t>
+      </w:r>
+      <w:r>
+        <w:t xml:space="preserve">Temp</w:t>
+      </w:r>
+      <w:r>
+        <w:t xml:space="preserve">’</w:t>
+      </w:r>
+      <w:r>
+        <w:t xml:space="preserve">,</w:t>
+      </w:r>
+      <w:r>
+        <w:t xml:space="preserve"> </w:t>
+      </w:r>
+      <w:r>
+        <w:t xml:space="preserve">‘</w:t>
+      </w:r>
+      <w:r>
+        <w:t xml:space="preserve">Temp_Max24h</w:t>
+      </w:r>
+      <w:r>
+        <w:t xml:space="preserve">’</w:t>
+      </w:r>
+      <w:r>
+        <w:t xml:space="preserve">,</w:t>
+      </w:r>
+      <w:r>
+        <w:t xml:space="preserve"> </w:t>
+      </w:r>
+      <w:r>
+        <w:t xml:space="preserve">‘</w:t>
+      </w:r>
+      <w:r>
+        <w:t xml:space="preserve">Temp_Min24h</w:t>
+      </w:r>
+      <w:r>
+        <w:t xml:space="preserve">’</w:t>
+      </w:r>
+      <w:r>
+        <w:t xml:space="preserve">,</w:t>
+      </w:r>
+      <w:r>
+        <w:t xml:space="preserve"> </w:t>
+      </w:r>
+      <w:r>
+        <w:t xml:space="preserve">‘</w:t>
+      </w:r>
+      <w:r>
+        <w:t xml:space="preserve">pH</w:t>
+      </w:r>
+      <w:r>
+        <w:t xml:space="preserve">’</w:t>
+      </w:r>
+      <w:r>
+        <w:t xml:space="preserve">,</w:t>
+      </w:r>
+      <w:r>
+        <w:t xml:space="preserve"> </w:t>
+      </w:r>
+      <w:r>
+        <w:t xml:space="preserve">‘</w:t>
+      </w:r>
+      <w:r>
+        <w:t xml:space="preserve">qSOFA_MetAmongMeasured</w:t>
+      </w:r>
+      <w:r>
+        <w:t xml:space="preserve">’</w:t>
+      </w:r>
+      <w:r>
+        <w:t xml:space="preserve">].</w:t>
+      </w:r>
+    </w:p>
+    <w:bookmarkStart w:id="28" w:name="Xe381885566852c7ed7463b04cf2adc3d35a68ee"/>
+    <w:p>
+      <w:pPr>
+        <w:pStyle w:val="Heading3"/>
+      </w:pPr>
+      <w:r>
+        <w:t xml:space="preserve">A. The deteriorating course of ICU-acquired sepsis is marked before onset by organ reserve, not by the vital signs (C7, now both databases)</w:t>
+      </w:r>
+    </w:p>
+    <w:p>
+      <w:pPr>
+        <w:pStyle w:val="FirstParagraph"/>
+      </w:pPr>
+      <w:r>
+        <w:t xml:space="preserve">Shared, deteriorating versus improving incident patients in the 12 hours before onset: urea (+0.39 / +0.50, strong), creatinine (+0.29 / +0.32), the renal SOFA component, the coagulation component, SOFA among measured (+0.26 / +0.34), NEWS2, and a lower oxygenation ratio (−0.21 / −0.24). Heart rate, temperature, blood pressure and the shock index show no course difference: the vital-sign signature of section 2 belongs to both courses. Database-specific: respiratory rate, GCS, bicarbonate and qSOFA in eICU; glucose, anion gap, platelet fall and oxygen saturation in MIMIC-IV; lactate in MIMIC-IV only (+0.45, not measured enough in eICU). This replaces section 4’s eICU-only reading and section 7’s H21: the pre-onset signature of the bad course is renal and respiratory reserve plus the coagulation axis, that is, how much organ function the patient has left when the second hit arrives, which fits the</w:t>
+      </w:r>
+      <w:r>
+        <w:t xml:space="preserve"> </w:t>
+      </w:r>
+      <w:r>
+        <w:t xml:space="preserve">“</w:t>
+      </w:r>
+      <w:r>
+        <w:t xml:space="preserve">second hit</w:t>
+      </w:r>
+      <w:r>
+        <w:t xml:space="preserve">”</w:t>
+      </w:r>
+      <w:r>
+        <w:t xml:space="preserve"> </w:t>
+      </w:r>
+      <w:r>
+        <w:t xml:space="preserve">account of the framework better than a louder inflammatory response. The compensation-state table no longer supports a shared pattern: in eICU deteriorating patients spend more hours compensated, in MIMIC-IV the courses do not differ.</w:t>
+      </w:r>
+    </w:p>
     <w:bookmarkEnd w:id="28"/>
+    <w:bookmarkStart w:id="29" w:name="X40918ba657967116125e7ad1b4cd1271225cda6"/>
+    <w:p>
+      <w:pPr>
+        <w:pStyle w:val="Heading3"/>
+      </w:pPr>
+      <w:r>
+        <w:t xml:space="preserve">B. With incident patients included, the early course separators (C10) are confirmed and GCS joins them</w:t>
+      </w:r>
+    </w:p>
+    <w:p>
+      <w:pPr>
+        <w:pStyle w:val="FirstParagraph"/>
+      </w:pPr>
+      <w:r>
+        <w:t xml:space="preserve">Shared at onset to +6 h, all septic strata: lactate (+0.29 / +0.53), urea, INR, FiO2, creatinine, lower pH and albumin, and now a lower GCS (−0.18 / −0.35). The +24 to +48 h window (C9) shows the full multi-organ picture and remains partly circular with the course definition.</w:t>
+      </w:r>
+    </w:p>
+    <w:bookmarkEnd w:id="29"/>
+    <w:bookmarkStart w:id="30" w:name="X3e568c41e70ca410f5c4557f33e09140b555043"/>
+    <w:p>
+      <w:pPr>
+        <w:pStyle w:val="Heading3"/>
+      </w:pPr>
+      <w:r>
+        <w:t xml:space="preserve">C. Anchored on the first antibiotic, the signature is the same but shorter, and a change signal appears (C2a, C6a, departure timing)</w:t>
+      </w:r>
+    </w:p>
+    <w:p>
+      <w:pPr>
+        <w:pStyle w:val="FirstParagraph"/>
+      </w:pPr>
+      <w:r>
+        <w:t xml:space="preserve">Twelve hours before the first antibiotic, against controls at a matched pseudo-antibiotic time, the shared channels are NEWS2 (+0.26 / +0.33), qSOFA, respiratory rate (+0.23 / +0.21), neutrophils, the 24-hour temperature minimum, lymphocytes (−0.20 / −0.18), albumin (−0.20 / −0.18) and the oxygenation ratio. The albumin and lymphocyte deltas are smaller than in the onset-anchored window because less time has passed. Heart rate and temperature are eICU-only here. The slope comparison, which found nothing shared when anchored on the operational onset, finds the qSOFA count rising in both databases (+0.17 / +0.23) when anchored on the antibiotic: clinicians act on a rising composite, and the change the model should learn is visible relative to the time they act, not relative to the label. Departure timing counted back from the antibiotic: NEWS2 sustained from 32 to 36 h before, qSOFA from 12 to 32 h, respiratory rate from 12 to 16 h, the oxygenation ratio from 4 to 12 h, lymphocytes, neutrophils and PTT from 4 to 8 h. This supports the 3-hour suspicion-anchored target: the strongest change is in the last 4 to 12 hours before the antibiotic.</w:t>
+      </w:r>
+    </w:p>
+    <w:bookmarkEnd w:id="30"/>
+    <w:bookmarkStart w:id="31" w:name="X277ebb021c97726b6cea6e0d83e1f7fbca7d8b5"/>
+    <w:p>
+      <w:pPr>
+        <w:pStyle w:val="Heading3"/>
+      </w:pPr>
+      <w:r>
+        <w:t xml:space="preserve">D. The operational label contains two populations (C2d, C2u, C3d)</w:t>
+      </w:r>
+    </w:p>
+    <w:p>
+      <w:pPr>
+        <w:pStyle w:val="FirstParagraph"/>
+      </w:pPr>
+      <w:r>
+        <w:t xml:space="preserve">Splitting incident patients by whether sepsis was also documented (coded for the admission in MIMIC-IV; listed or an admission diagnosis in eICU) changes the picture more than any other cut. Documented incident patients carry a broad, strong, shared pre-onset signature: albumin −0.46 / −0.52 (strong), NEWS2 +0.48 / +0.45 (strong), shock index +0.39 / +0.46 (strong), qSOFA strong, and shared heart rate (+0.30 / +0.42), respiratory rate (+0.29 / +0.42), lower systolic, diastolic and mean pressure (−0.24 to −0.35), temperature and its maximum, neutrophil-to-lymphocyte ratio, creatinine, urea, the renal and cardiovascular SOFA components, anion gap and haemoglobin. Undocumented incident patients show almost nothing shared: a lower bilirubin, a higher PTT and a weaker NEWS2. The blood-pressure signals that were absent in the pooled comparison of section 2 were diluted away by the undocumented half. Between documented arrivals and documented incident patients (C3d) the differences also shrink to the temperature maximum, base excess and total SOFA; much of the arrival-versus-incident contrast of section 3 came from the undocumented, mild incident cases.</w:t>
+      </w:r>
+    </w:p>
+    <w:p>
+      <w:pPr>
+        <w:pStyle w:val="BodyText"/>
+      </w:pPr>
+      <w:r>
+        <w:t xml:space="preserve">Reading: roughly half to two thirds of operationally labelled ICU-acquired sepsis in these samples is sepsis that no clinician documented, and it is physiologically close to the controls. The operational label is therefore a mixture, and part of the modest pre-onset signal of section 2 is the mixture, not the disease. Documentation is retrospective and can never be a predictor, but it is a legitimate outcome stratum and a candidate sensitivity label.</w:t>
+      </w:r>
+    </w:p>
+    <w:bookmarkEnd w:id="31"/>
+    <w:bookmarkStart w:id="32" w:name="e.-what-changes-in-the-proposals"/>
+    <w:p>
+      <w:pPr>
+        <w:pStyle w:val="Heading3"/>
+      </w:pPr>
+      <w:r>
+        <w:t xml:space="preserve">E. What changes in the proposals</w:t>
+      </w:r>
+    </w:p>
+    <w:p>
+      <w:pPr>
+        <w:numPr>
+          <w:ilvl w:val="0"/>
+          <w:numId w:val="1005"/>
+        </w:numPr>
+        <w:pStyle w:val="Compact"/>
+      </w:pPr>
+      <w:r>
+        <w:t xml:space="preserve">The label sensitivity evaluations of protocol 10c.2 item 10 should include the documented-sepsis label as a scoring label and, if the stage-2 budget allows, as a sensitivity training target; its physiology is the cleanest the data offer.</w:t>
+      </w:r>
+    </w:p>
+    <w:p>
+      <w:pPr>
+        <w:numPr>
+          <w:ilvl w:val="0"/>
+          <w:numId w:val="1005"/>
+        </w:numPr>
+        <w:pStyle w:val="Compact"/>
+      </w:pPr>
+      <w:r>
+        <w:t xml:space="preserve">The suspicion-anchored target with a 3-hour horizon is supported by C6a and the antibiotic-anchored departure timing: the change signal lives in the last 4 to 12 hours before the antibiotic.</w:t>
+      </w:r>
+    </w:p>
+    <w:p>
+      <w:pPr>
+        <w:numPr>
+          <w:ilvl w:val="0"/>
+          <w:numId w:val="1005"/>
+        </w:numPr>
+        <w:pStyle w:val="Compact"/>
+      </w:pPr>
+      <w:r>
+        <w:t xml:space="preserve">The deterioration target, if prespecified, should be built on renal and respiratory reserve and the coagulation axis at and before onset, not on the vital signs.</w:t>
+      </w:r>
+    </w:p>
+    <w:p>
+      <w:pPr>
+        <w:numPr>
+          <w:ilvl w:val="0"/>
+          <w:numId w:val="1005"/>
+        </w:numPr>
+        <w:pStyle w:val="Compact"/>
+      </w:pPr>
+      <w:r>
+        <w:t xml:space="preserve">Hypothesis scorecard corrections: H21 heart rate not supported; respiratory rate, platelet fall, urine output and lactate supported in one database; H13 GCS now supported at onset (C10) though not before it.</w:t>
+      </w:r>
+    </w:p>
+    <w:bookmarkEnd w:id="32"/>
+    <w:bookmarkEnd w:id="33"/>
+    <w:bookmarkEnd w:id="34"/>
     <w:sectPr/>
   </w:body>
 </w:document>
@@ -2202,6 +2590,36 @@
     </w:lvlOverride>
   </w:num>
   <w:num w:numId="1004">
+    <w:abstractNumId w:val="99411"/>
+    <w:lvlOverride w:ilvl="0">
+      <w:startOverride w:val="1"/>
+    </w:lvlOverride>
+    <w:lvlOverride w:ilvl="1">
+      <w:startOverride w:val="1"/>
+    </w:lvlOverride>
+    <w:lvlOverride w:ilvl="2">
+      <w:startOverride w:val="1"/>
+    </w:lvlOverride>
+    <w:lvlOverride w:ilvl="3">
+      <w:startOverride w:val="1"/>
+    </w:lvlOverride>
+    <w:lvlOverride w:ilvl="4">
+      <w:startOverride w:val="1"/>
+    </w:lvlOverride>
+    <w:lvlOverride w:ilvl="5">
+      <w:startOverride w:val="1"/>
+    </w:lvlOverride>
+    <w:lvlOverride w:ilvl="6">
+      <w:startOverride w:val="1"/>
+    </w:lvlOverride>
+    <w:lvlOverride w:ilvl="7">
+      <w:startOverride w:val="1"/>
+    </w:lvlOverride>
+    <w:lvlOverride w:ilvl="8">
+      <w:startOverride w:val="1"/>
+    </w:lvlOverride>
+  </w:num>
+  <w:num w:numId="1005">
     <w:abstractNumId w:val="99411"/>
     <w:lvlOverride w:ilvl="0">
       <w:startOverride w:val="1"/>

</xml_diff>